<commit_message>
Week 5 Day 2: one concept and one or more students; DOK not rubric; five roles; journal date; trims
Co-Authored-By: Claude Opus 5 (1M context) <noreply@anthropic.com>
</commit_message>
<xml_diff>
--- a/week-5-assessment-rubrics/week-5-pedagogical-excursion.docx
+++ b/week-5-assessment-rubrics/week-5-pedagogical-excursion.docx
@@ -20,7 +20,18 @@
           <w:sz w:val="24"/>
           <w:szCs w:val="24"/>
         </w:rPr>
-        <w:t>Pedagogical Excursion #5 — Reading a Learner with a Rubric</w:t>
+        <w:t xml:space="preserve">Pedagogical Excursion #5 — </w:t>
+      </w:r>
+      <w:r>
+        <w:rPr>
+          <w:rFonts w:eastAsia="ＭＳ ゴシック" w:cs="Calibri" w:eastAsiaTheme="majorEastAsia"/>
+          <w:b/>
+          <w:bCs/>
+          <w:color w:val="1F4E96"/>
+          <w:sz w:val="24"/>
+          <w:szCs w:val="24"/>
+        </w:rPr>
+        <w:t>Responding to Student Work</w:t>
       </w:r>
     </w:p>
     <w:p>

</xml_diff>